<commit_message>
s-a reparat functia de generare documente si s-a modificat pentru a adauga cate persoane trainuite vrem
</commit_message>
<xml_diff>
--- a/ServiceApp/src/main/resources/templates/certificat_garantie.docx
+++ b/ServiceApp/src/main/resources/templates/certificat_garantie.docx
@@ -254,27 +254,7 @@
                 <w:color w:val="000000"/>
                 <w:lang w:val="ro-RO" w:eastAsia="ro-RO"/>
               </w:rPr>
-              <w:t>${</w:t>
-            </w:r>
-            <w:r>
-              <w:rPr>
-                <w:rFonts w:ascii="Aptos" w:hAnsi="Aptos"/>
-                <w:b/>
-                <w:bCs/>
-                <w:color w:val="000000"/>
-                <w:lang w:val="ro-RO" w:eastAsia="ro-RO"/>
-              </w:rPr>
-              <w:t>equipmentName</w:t>
-            </w:r>
-            <w:r>
-              <w:rPr>
-                <w:rFonts w:ascii="Aptos" w:hAnsi="Aptos"/>
-                <w:b/>
-                <w:bCs/>
-                <w:color w:val="000000"/>
-                <w:lang w:val="ro-RO" w:eastAsia="ro-RO"/>
-              </w:rPr>
-              <w:t>}</w:t>
+              <w:t>${equipmentName}</w:t>
             </w:r>
           </w:p>
         </w:tc>
@@ -384,8 +364,8 @@
       </w:tblPr>
       <w:tblGrid>
         <w:gridCol w:w="3389"/>
-        <w:gridCol w:w="2392"/>
-        <w:gridCol w:w="2383"/>
+        <w:gridCol w:w="2396"/>
+        <w:gridCol w:w="2379"/>
         <w:gridCol w:w="1804"/>
       </w:tblGrid>
       <w:tr>
@@ -421,7 +401,7 @@
         </w:tc>
         <w:tc>
           <w:tcPr>
-            <w:tcW w:w="2392" w:type="dxa"/>
+            <w:tcW w:w="2396" w:type="dxa"/>
             <w:tcBorders>
               <w:top w:val="single" w:sz="4" w:space="0" w:color="000000"/>
               <w:left w:val="single" w:sz="4" w:space="0" w:color="000000"/>
@@ -450,7 +430,7 @@
         </w:tc>
         <w:tc>
           <w:tcPr>
-            <w:tcW w:w="2383" w:type="dxa"/>
+            <w:tcW w:w="2379" w:type="dxa"/>
             <w:tcBorders>
               <w:top w:val="single" w:sz="4" w:space="0" w:color="000000"/>
               <w:left w:val="single" w:sz="4" w:space="0" w:color="000000"/>
@@ -566,7 +546,7 @@
         </w:tc>
         <w:tc>
           <w:tcPr>
-            <w:tcW w:w="2392" w:type="dxa"/>
+            <w:tcW w:w="2396" w:type="dxa"/>
             <w:tcBorders>
               <w:top w:val="single" w:sz="4" w:space="0" w:color="000000"/>
               <w:left w:val="single" w:sz="4" w:space="0" w:color="000000"/>
@@ -637,7 +617,7 @@
         </w:tc>
         <w:tc>
           <w:tcPr>
-            <w:tcW w:w="2383" w:type="dxa"/>
+            <w:tcW w:w="2379" w:type="dxa"/>
             <w:tcBorders>
               <w:top w:val="single" w:sz="4" w:space="0" w:color="000000"/>
               <w:left w:val="single" w:sz="4" w:space="0" w:color="000000"/>
@@ -865,48 +845,14 @@
         </w:rPr>
         <w:t>, pentru piesele aditionale cu seriile:</w:t>
       </w:r>
-    </w:p>
-    <w:p>
-      <w:pPr>
-        <w:pStyle w:val="ListParagraph"/>
-        <w:suppressAutoHyphens w:val="true"/>
-        <w:ind w:left="1512"/>
-        <w:jc w:val="both"/>
-        <w:rPr>
-          <w:rFonts w:ascii="Aptos" w:hAnsi="Aptos"/>
-          <w:b/>
-          <w:lang w:val="ro-RO" w:eastAsia="ro-RO"/>
-        </w:rPr>
-      </w:pPr>
-      <w:r>
-        <w:rPr>
-          <w:rFonts w:ascii="Aptos" w:hAnsi="Aptos"/>
-          <w:b/>
-          <w:lang w:val="ro-RO" w:eastAsia="ro-RO"/>
-        </w:rPr>
-        <w:t>${serialNumber2}, ${serialNumber3}, ${serialNumber4},</w:t>
-      </w:r>
-    </w:p>
-    <w:p>
-      <w:pPr>
-        <w:pStyle w:val="ListParagraph"/>
-        <w:suppressAutoHyphens w:val="true"/>
-        <w:ind w:left="1512"/>
-        <w:jc w:val="both"/>
+      <w:r>
         <w:rPr>
           <w:rFonts w:ascii="Aptos" w:hAnsi="Aptos"/>
           <w:b/>
           <w:bCs/>
-          <w:lang w:val="ro-RO"/>
-        </w:rPr>
-      </w:pPr>
-      <w:r>
-        <w:rPr>
-          <w:rFonts w:ascii="Aptos" w:hAnsi="Aptos"/>
-          <w:b/>
           <w:lang w:val="ro-RO" w:eastAsia="ro-RO"/>
         </w:rPr>
-        <w:t>${serialNumber5}, ${serialNumber6}</w:t>
+        <w:t xml:space="preserve"> </w:t>
       </w:r>
     </w:p>
     <w:p>
@@ -1375,7 +1321,7 @@
         </w:rPr>
         <w:t xml:space="preserve"> </w:t>
       </w:r>
-      <w:bookmarkStart w:id="0" w:name="_Hlk188459439"/>
+      <w:bookmarkStart w:id="2" w:name="_Hlk188459439"/>
       <w:r>
         <w:rPr>
           <w:rFonts w:ascii="Aptos" w:hAnsi="Aptos"/>
@@ -1392,7 +1338,7 @@
         </w:rPr>
         <w:t>${customerName}</w:t>
       </w:r>
-      <w:bookmarkEnd w:id="0"/>
+      <w:bookmarkEnd w:id="2"/>
     </w:p>
     <w:p>
       <w:pPr>
@@ -1471,7 +1417,7 @@
       </w:pPr>
       <w:r>
         <w:drawing>
-          <wp:anchor behindDoc="0" distT="0" distB="0" distL="0" distR="0" simplePos="0" locked="0" layoutInCell="0" allowOverlap="1" relativeHeight="2">
+          <wp:anchor behindDoc="0" distT="0" distB="0" distL="0" distR="0" simplePos="0" locked="0" layoutInCell="0" allowOverlap="1" relativeHeight="12">
             <wp:simplePos x="0" y="0"/>
             <wp:positionH relativeFrom="margin">
               <wp:posOffset>603250</wp:posOffset>
@@ -1625,10 +1571,12 @@
   <w:p>
     <w:pPr>
       <w:pStyle w:val="Footer"/>
+      <w:jc w:val="center"/>
       <w:rPr>
         <w:lang w:val="pt-BR"/>
       </w:rPr>
     </w:pPr>
+    <w:bookmarkStart w:id="0" w:name="PageNumWizard_FOOTER_Default_Page_Style1"/>
     <w:r>
       <w:rPr>
         <w:lang w:val="pt-BR"/>
@@ -1636,7 +1584,7 @@
       <mc:AlternateContent>
         <mc:Choice Requires="wps">
           <w:drawing>
-            <wp:anchor behindDoc="1" distT="0" distB="0" distL="0" distR="0" simplePos="0" locked="0" layoutInCell="1" allowOverlap="1" relativeHeight="10" wp14:anchorId="54B16E29">
+            <wp:anchor behindDoc="1" distT="0" distB="0" distL="0" distR="0" simplePos="0" locked="0" layoutInCell="1" allowOverlap="1" relativeHeight="7" wp14:anchorId="54B16E29">
               <wp:simplePos x="0" y="0"/>
               <wp:positionH relativeFrom="column">
                 <wp:posOffset>-1339850</wp:posOffset>
@@ -1687,6 +1635,7 @@
                           <w:r>
                             <w:rPr>
                               <w:rFonts w:cs="Calibri" w:ascii="Aptos" w:hAnsi="Aptos" w:cstheme="minorHAnsi"/>
+                              <w:color w:val="000000"/>
                               <w:sz w:val="12"/>
                               <w:szCs w:val="12"/>
                             </w:rPr>
@@ -1707,6 +1656,7 @@
                           <w:r>
                             <w:rPr>
                               <w:rFonts w:cs="Calibri" w:ascii="Aptos" w:hAnsi="Aptos" w:cstheme="minorHAnsi"/>
+                              <w:color w:val="000000"/>
                               <w:sz w:val="12"/>
                               <w:szCs w:val="12"/>
                             </w:rPr>
@@ -1727,6 +1677,7 @@
                           <w:r>
                             <w:rPr>
                               <w:rFonts w:cs="Calibri" w:ascii="Aptos" w:hAnsi="Aptos" w:cstheme="minorHAnsi"/>
+                              <w:color w:val="000000"/>
                               <w:sz w:val="12"/>
                               <w:szCs w:val="12"/>
                             </w:rPr>
@@ -1747,6 +1698,7 @@
                           <w:r>
                             <w:rPr>
                               <w:rFonts w:cs="Calibri" w:ascii="Aptos" w:hAnsi="Aptos" w:cstheme="minorHAnsi"/>
+                              <w:color w:val="000000"/>
                               <w:sz w:val="12"/>
                               <w:szCs w:val="12"/>
                             </w:rPr>
@@ -1767,6 +1719,7 @@
                           <w:r>
                             <w:rPr>
                               <w:rFonts w:cs="Calibri" w:ascii="Aptos" w:hAnsi="Aptos" w:cstheme="minorHAnsi"/>
+                              <w:color w:val="000000"/>
                               <w:sz w:val="12"/>
                               <w:szCs w:val="12"/>
                             </w:rPr>
@@ -1787,6 +1740,7 @@
                           <w:r>
                             <w:rPr>
                               <w:rFonts w:cs="Calibri" w:ascii="Aptos" w:hAnsi="Aptos" w:cstheme="minorHAnsi"/>
+                              <w:color w:val="000000"/>
                               <w:sz w:val="12"/>
                               <w:szCs w:val="12"/>
                             </w:rPr>
@@ -1807,6 +1761,7 @@
                           <w:r>
                             <w:rPr>
                               <w:rFonts w:cs="Calibri" w:ascii="Aptos" w:hAnsi="Aptos" w:cstheme="minorHAnsi"/>
+                              <w:color w:val="000000"/>
                               <w:sz w:val="12"/>
                               <w:szCs w:val="12"/>
                             </w:rPr>
@@ -1827,6 +1782,7 @@
                           <w:r>
                             <w:rPr>
                               <w:rFonts w:cs="Calibri" w:ascii="Aptos" w:hAnsi="Aptos" w:cstheme="minorHAnsi"/>
+                              <w:color w:val="000000"/>
                               <w:sz w:val="12"/>
                               <w:szCs w:val="12"/>
                             </w:rPr>
@@ -1854,7 +1810,7 @@
           <w:pict>
             <v:rect id="shape_0" ID="Text Box 2" path="m0,0l-2147483645,0l-2147483645,-2147483646l0,-2147483646xe" stroked="f" o:allowincell="f" style="position:absolute;margin-left:-105.5pt;margin-top:-44.55pt;width:180.4pt;height:72.65pt;mso-wrap-style:square;v-text-anchor:top" wp14:anchorId="54B16E29">
               <v:fill o:detectmouseclick="t" on="false"/>
-              <v:stroke color="#3465a4" weight="9360" joinstyle="miter" endcap="flat"/>
+              <v:stroke color="#3465a4" weight="9360" joinstyle="round" endcap="flat"/>
               <v:textbox>
                 <w:txbxContent>
                   <w:p>
@@ -1871,6 +1827,7 @@
                     <w:r>
                       <w:rPr>
                         <w:rFonts w:cs="Calibri" w:ascii="Aptos" w:hAnsi="Aptos" w:cstheme="minorHAnsi"/>
+                        <w:color w:val="000000"/>
                         <w:sz w:val="12"/>
                         <w:szCs w:val="12"/>
                       </w:rPr>
@@ -1891,6 +1848,7 @@
                     <w:r>
                       <w:rPr>
                         <w:rFonts w:cs="Calibri" w:ascii="Aptos" w:hAnsi="Aptos" w:cstheme="minorHAnsi"/>
+                        <w:color w:val="000000"/>
                         <w:sz w:val="12"/>
                         <w:szCs w:val="12"/>
                       </w:rPr>
@@ -1911,6 +1869,7 @@
                     <w:r>
                       <w:rPr>
                         <w:rFonts w:cs="Calibri" w:ascii="Aptos" w:hAnsi="Aptos" w:cstheme="minorHAnsi"/>
+                        <w:color w:val="000000"/>
                         <w:sz w:val="12"/>
                         <w:szCs w:val="12"/>
                       </w:rPr>
@@ -1931,6 +1890,7 @@
                     <w:r>
                       <w:rPr>
                         <w:rFonts w:cs="Calibri" w:ascii="Aptos" w:hAnsi="Aptos" w:cstheme="minorHAnsi"/>
+                        <w:color w:val="000000"/>
                         <w:sz w:val="12"/>
                         <w:szCs w:val="12"/>
                       </w:rPr>
@@ -1951,6 +1911,7 @@
                     <w:r>
                       <w:rPr>
                         <w:rFonts w:cs="Calibri" w:ascii="Aptos" w:hAnsi="Aptos" w:cstheme="minorHAnsi"/>
+                        <w:color w:val="000000"/>
                         <w:sz w:val="12"/>
                         <w:szCs w:val="12"/>
                       </w:rPr>
@@ -1971,6 +1932,7 @@
                     <w:r>
                       <w:rPr>
                         <w:rFonts w:cs="Calibri" w:ascii="Aptos" w:hAnsi="Aptos" w:cstheme="minorHAnsi"/>
+                        <w:color w:val="000000"/>
                         <w:sz w:val="12"/>
                         <w:szCs w:val="12"/>
                       </w:rPr>
@@ -1991,6 +1953,7 @@
                     <w:r>
                       <w:rPr>
                         <w:rFonts w:cs="Calibri" w:ascii="Aptos" w:hAnsi="Aptos" w:cstheme="minorHAnsi"/>
+                        <w:color w:val="000000"/>
                         <w:sz w:val="12"/>
                         <w:szCs w:val="12"/>
                       </w:rPr>
@@ -2011,6 +1974,7 @@
                     <w:r>
                       <w:rPr>
                         <w:rFonts w:cs="Calibri" w:ascii="Aptos" w:hAnsi="Aptos" w:cstheme="minorHAnsi"/>
+                        <w:color w:val="000000"/>
                         <w:sz w:val="12"/>
                         <w:szCs w:val="12"/>
                       </w:rPr>
@@ -2025,7 +1989,7 @@
         </mc:Fallback>
       </mc:AlternateContent>
       <w:drawing>
-        <wp:anchor behindDoc="1" distT="0" distB="0" distL="0" distR="0" simplePos="0" locked="0" layoutInCell="1" allowOverlap="1" relativeHeight="14">
+        <wp:anchor behindDoc="1" distT="0" distB="0" distL="0" distR="0" simplePos="0" locked="0" layoutInCell="1" allowOverlap="1" relativeHeight="11">
           <wp:simplePos x="0" y="0"/>
           <wp:positionH relativeFrom="column">
             <wp:posOffset>147320</wp:posOffset>
@@ -2075,7 +2039,33 @@
           </a:graphic>
         </wp:anchor>
       </w:drawing>
+      <w:fldChar w:fldCharType="begin"/>
     </w:r>
+    <w:r>
+      <w:rPr>
+        <w:lang w:val="pt-BR"/>
+      </w:rPr>
+      <w:instrText xml:space="preserve"> PAGE </w:instrText>
+    </w:r>
+    <w:r>
+      <w:rPr>
+        <w:lang w:val="pt-BR"/>
+      </w:rPr>
+      <w:fldChar w:fldCharType="separate"/>
+    </w:r>
+    <w:r>
+      <w:rPr>
+        <w:lang w:val="pt-BR"/>
+      </w:rPr>
+      <w:t>3</w:t>
+    </w:r>
+    <w:r>
+      <w:rPr>
+        <w:lang w:val="pt-BR"/>
+      </w:rPr>
+      <w:fldChar w:fldCharType="end"/>
+    </w:r>
+    <w:bookmarkEnd w:id="0"/>
   </w:p>
 </w:ftr>
 </file>
@@ -2085,10 +2075,12 @@
   <w:p>
     <w:pPr>
       <w:pStyle w:val="Footer"/>
+      <w:jc w:val="center"/>
       <w:rPr>
         <w:lang w:val="pt-BR"/>
       </w:rPr>
     </w:pPr>
+    <w:bookmarkStart w:id="1" w:name="PageNumWizard_FOOTER_Default_Page_Style1"/>
     <w:r>
       <w:rPr>
         <w:lang w:val="pt-BR"/>
@@ -2096,7 +2088,7 @@
       <mc:AlternateContent>
         <mc:Choice Requires="wps">
           <w:drawing>
-            <wp:anchor behindDoc="1" distT="0" distB="0" distL="0" distR="0" simplePos="0" locked="0" layoutInCell="1" allowOverlap="1" relativeHeight="10" wp14:anchorId="54B16E29">
+            <wp:anchor behindDoc="1" distT="0" distB="0" distL="0" distR="0" simplePos="0" locked="0" layoutInCell="1" allowOverlap="1" relativeHeight="7" wp14:anchorId="54B16E29">
               <wp:simplePos x="0" y="0"/>
               <wp:positionH relativeFrom="column">
                 <wp:posOffset>-1339850</wp:posOffset>
@@ -2147,6 +2139,7 @@
                           <w:r>
                             <w:rPr>
                               <w:rFonts w:cs="Calibri" w:ascii="Aptos" w:hAnsi="Aptos" w:cstheme="minorHAnsi"/>
+                              <w:color w:val="000000"/>
                               <w:sz w:val="12"/>
                               <w:szCs w:val="12"/>
                             </w:rPr>
@@ -2167,6 +2160,7 @@
                           <w:r>
                             <w:rPr>
                               <w:rFonts w:cs="Calibri" w:ascii="Aptos" w:hAnsi="Aptos" w:cstheme="minorHAnsi"/>
+                              <w:color w:val="000000"/>
                               <w:sz w:val="12"/>
                               <w:szCs w:val="12"/>
                             </w:rPr>
@@ -2187,6 +2181,7 @@
                           <w:r>
                             <w:rPr>
                               <w:rFonts w:cs="Calibri" w:ascii="Aptos" w:hAnsi="Aptos" w:cstheme="minorHAnsi"/>
+                              <w:color w:val="000000"/>
                               <w:sz w:val="12"/>
                               <w:szCs w:val="12"/>
                             </w:rPr>
@@ -2207,6 +2202,7 @@
                           <w:r>
                             <w:rPr>
                               <w:rFonts w:cs="Calibri" w:ascii="Aptos" w:hAnsi="Aptos" w:cstheme="minorHAnsi"/>
+                              <w:color w:val="000000"/>
                               <w:sz w:val="12"/>
                               <w:szCs w:val="12"/>
                             </w:rPr>
@@ -2227,6 +2223,7 @@
                           <w:r>
                             <w:rPr>
                               <w:rFonts w:cs="Calibri" w:ascii="Aptos" w:hAnsi="Aptos" w:cstheme="minorHAnsi"/>
+                              <w:color w:val="000000"/>
                               <w:sz w:val="12"/>
                               <w:szCs w:val="12"/>
                             </w:rPr>
@@ -2247,6 +2244,7 @@
                           <w:r>
                             <w:rPr>
                               <w:rFonts w:cs="Calibri" w:ascii="Aptos" w:hAnsi="Aptos" w:cstheme="minorHAnsi"/>
+                              <w:color w:val="000000"/>
                               <w:sz w:val="12"/>
                               <w:szCs w:val="12"/>
                             </w:rPr>
@@ -2267,6 +2265,7 @@
                           <w:r>
                             <w:rPr>
                               <w:rFonts w:cs="Calibri" w:ascii="Aptos" w:hAnsi="Aptos" w:cstheme="minorHAnsi"/>
+                              <w:color w:val="000000"/>
                               <w:sz w:val="12"/>
                               <w:szCs w:val="12"/>
                             </w:rPr>
@@ -2287,6 +2286,7 @@
                           <w:r>
                             <w:rPr>
                               <w:rFonts w:cs="Calibri" w:ascii="Aptos" w:hAnsi="Aptos" w:cstheme="minorHAnsi"/>
+                              <w:color w:val="000000"/>
                               <w:sz w:val="12"/>
                               <w:szCs w:val="12"/>
                             </w:rPr>
@@ -2314,7 +2314,7 @@
           <w:pict>
             <v:rect id="shape_0" ID="Text Box 2" path="m0,0l-2147483645,0l-2147483645,-2147483646l0,-2147483646xe" stroked="f" o:allowincell="f" style="position:absolute;margin-left:-105.5pt;margin-top:-44.55pt;width:180.4pt;height:72.65pt;mso-wrap-style:square;v-text-anchor:top" wp14:anchorId="54B16E29">
               <v:fill o:detectmouseclick="t" on="false"/>
-              <v:stroke color="#3465a4" weight="9360" joinstyle="miter" endcap="flat"/>
+              <v:stroke color="#3465a4" weight="9360" joinstyle="round" endcap="flat"/>
               <v:textbox>
                 <w:txbxContent>
                   <w:p>
@@ -2331,6 +2331,7 @@
                     <w:r>
                       <w:rPr>
                         <w:rFonts w:cs="Calibri" w:ascii="Aptos" w:hAnsi="Aptos" w:cstheme="minorHAnsi"/>
+                        <w:color w:val="000000"/>
                         <w:sz w:val="12"/>
                         <w:szCs w:val="12"/>
                       </w:rPr>
@@ -2351,6 +2352,7 @@
                     <w:r>
                       <w:rPr>
                         <w:rFonts w:cs="Calibri" w:ascii="Aptos" w:hAnsi="Aptos" w:cstheme="minorHAnsi"/>
+                        <w:color w:val="000000"/>
                         <w:sz w:val="12"/>
                         <w:szCs w:val="12"/>
                       </w:rPr>
@@ -2371,6 +2373,7 @@
                     <w:r>
                       <w:rPr>
                         <w:rFonts w:cs="Calibri" w:ascii="Aptos" w:hAnsi="Aptos" w:cstheme="minorHAnsi"/>
+                        <w:color w:val="000000"/>
                         <w:sz w:val="12"/>
                         <w:szCs w:val="12"/>
                       </w:rPr>
@@ -2391,6 +2394,7 @@
                     <w:r>
                       <w:rPr>
                         <w:rFonts w:cs="Calibri" w:ascii="Aptos" w:hAnsi="Aptos" w:cstheme="minorHAnsi"/>
+                        <w:color w:val="000000"/>
                         <w:sz w:val="12"/>
                         <w:szCs w:val="12"/>
                       </w:rPr>
@@ -2411,6 +2415,7 @@
                     <w:r>
                       <w:rPr>
                         <w:rFonts w:cs="Calibri" w:ascii="Aptos" w:hAnsi="Aptos" w:cstheme="minorHAnsi"/>
+                        <w:color w:val="000000"/>
                         <w:sz w:val="12"/>
                         <w:szCs w:val="12"/>
                       </w:rPr>
@@ -2431,6 +2436,7 @@
                     <w:r>
                       <w:rPr>
                         <w:rFonts w:cs="Calibri" w:ascii="Aptos" w:hAnsi="Aptos" w:cstheme="minorHAnsi"/>
+                        <w:color w:val="000000"/>
                         <w:sz w:val="12"/>
                         <w:szCs w:val="12"/>
                       </w:rPr>
@@ -2451,6 +2457,7 @@
                     <w:r>
                       <w:rPr>
                         <w:rFonts w:cs="Calibri" w:ascii="Aptos" w:hAnsi="Aptos" w:cstheme="minorHAnsi"/>
+                        <w:color w:val="000000"/>
                         <w:sz w:val="12"/>
                         <w:szCs w:val="12"/>
                       </w:rPr>
@@ -2471,6 +2478,7 @@
                     <w:r>
                       <w:rPr>
                         <w:rFonts w:cs="Calibri" w:ascii="Aptos" w:hAnsi="Aptos" w:cstheme="minorHAnsi"/>
+                        <w:color w:val="000000"/>
                         <w:sz w:val="12"/>
                         <w:szCs w:val="12"/>
                       </w:rPr>
@@ -2485,7 +2493,7 @@
         </mc:Fallback>
       </mc:AlternateContent>
       <w:drawing>
-        <wp:anchor behindDoc="1" distT="0" distB="0" distL="0" distR="0" simplePos="0" locked="0" layoutInCell="1" allowOverlap="1" relativeHeight="14">
+        <wp:anchor behindDoc="1" distT="0" distB="0" distL="0" distR="0" simplePos="0" locked="0" layoutInCell="1" allowOverlap="1" relativeHeight="11">
           <wp:simplePos x="0" y="0"/>
           <wp:positionH relativeFrom="column">
             <wp:posOffset>147320</wp:posOffset>
@@ -2535,7 +2543,33 @@
           </a:graphic>
         </wp:anchor>
       </w:drawing>
+      <w:fldChar w:fldCharType="begin"/>
     </w:r>
+    <w:r>
+      <w:rPr>
+        <w:lang w:val="pt-BR"/>
+      </w:rPr>
+      <w:instrText xml:space="preserve"> PAGE </w:instrText>
+    </w:r>
+    <w:r>
+      <w:rPr>
+        <w:lang w:val="pt-BR"/>
+      </w:rPr>
+      <w:fldChar w:fldCharType="separate"/>
+    </w:r>
+    <w:r>
+      <w:rPr>
+        <w:lang w:val="pt-BR"/>
+      </w:rPr>
+      <w:t>3</w:t>
+    </w:r>
+    <w:r>
+      <w:rPr>
+        <w:lang w:val="pt-BR"/>
+      </w:rPr>
+      <w:fldChar w:fldCharType="end"/>
+    </w:r>
+    <w:bookmarkEnd w:id="1"/>
   </w:p>
 </w:ftr>
 </file>
@@ -2632,7 +2666,7 @@
     <w:r>
       <w:rPr/>
       <w:drawing>
-        <wp:anchor behindDoc="1" distT="0" distB="0" distL="0" distR="0" simplePos="0" locked="0" layoutInCell="0" allowOverlap="1" relativeHeight="5">
+        <wp:anchor behindDoc="1" distT="0" distB="0" distL="0" distR="0" simplePos="0" locked="0" layoutInCell="0" allowOverlap="1" relativeHeight="15">
           <wp:simplePos x="0" y="0"/>
           <wp:positionH relativeFrom="margin">
             <wp:posOffset>-590550</wp:posOffset>
@@ -2697,7 +2731,7 @@
     <w:r>
       <w:rPr/>
       <w:drawing>
-        <wp:anchor behindDoc="1" distT="0" distB="0" distL="0" distR="0" simplePos="0" locked="0" layoutInCell="0" allowOverlap="1" relativeHeight="5">
+        <wp:anchor behindDoc="1" distT="0" distB="0" distL="0" distR="0" simplePos="0" locked="0" layoutInCell="0" allowOverlap="1" relativeHeight="15">
           <wp:simplePos x="0" y="0"/>
           <wp:positionH relativeFrom="margin">
             <wp:posOffset>-590550</wp:posOffset>
@@ -3552,6 +3586,7 @@
     <w:rsid w:val="00b80509"/>
     <w:pPr>
       <w:widowControl/>
+      <w:suppressAutoHyphens w:val="true"/>
       <w:bidi w:val="0"/>
       <w:spacing w:lineRule="auto" w:line="259" w:before="0" w:after="160"/>
       <w:jc w:val="left"/>
@@ -4009,7 +4044,6 @@
   </w:style>
   <w:style w:type="character" w:styleId="FootnoteCharacters">
     <w:name w:val="Footnote Characters"/>
-    <w:basedOn w:val="DefaultParagraphFont"/>
     <w:qFormat/>
     <w:rsid w:val="00b80509"/>
     <w:rPr>
@@ -4036,16 +4070,18 @@
       <w:szCs w:val="20"/>
     </w:rPr>
   </w:style>
+  <w:style w:type="character" w:styleId="EndnoteCharacters">
+    <w:name w:val="Endnote Characters"/>
+    <w:qFormat/>
+    <w:rPr>
+      <w:vertAlign w:val="superscript"/>
+    </w:rPr>
+  </w:style>
   <w:style w:type="character" w:styleId="EndnoteReference">
     <w:name w:val="Endnote Reference"/>
     <w:rPr>
       <w:vertAlign w:val="superscript"/>
     </w:rPr>
-  </w:style>
-  <w:style w:type="character" w:styleId="EndnoteCharacters">
-    <w:name w:val="Endnote Characters"/>
-    <w:qFormat/>
-    <w:rPr/>
   </w:style>
   <w:style w:type="paragraph" w:styleId="Heading">
     <w:name w:val="Heading"/>
@@ -4253,7 +4289,7 @@
       <w:kern w:val="0"/>
       <w:sz w:val="24"/>
       <w:szCs w:val="24"/>
-      <w:lang w:eastAsia="ro-RO" w:val="en-US" w:bidi="ar-SA"/>
+      <w:lang w:val="en-US" w:eastAsia="ro-RO" w:bidi="ar-SA"/>
       <w14:ligatures w14:val="none"/>
     </w:rPr>
   </w:style>

</xml_diff>